<commit_message>
Completed multiple  merge functions and started converting date fields
</commit_message>
<xml_diff>
--- a/project/documents/letters/AdobeSignEmail.docx
+++ b/project/documents/letters/AdobeSignEmail.docx
@@ -29,7 +29,15 @@
         <w:t xml:space="preserve">&lt;&lt;userChoice&gt;&gt; </w:t>
       </w:r>
       <w:r>
-        <w:t xml:space="preserve">- SLW# &lt;&lt;this.matterNo&gt;&gt; - Application# - &lt;&lt;this.serialNo&gt;&gt; </w:t>
+        <w:t>- SLW# &lt;&lt;</w:t>
+      </w:r>
+      <w:proofErr w:type="gramStart"/>
+      <w:r>
+        <w:t>this.matterNo</w:t>
+      </w:r>
+      <w:proofErr w:type="gramEnd"/>
+      <w:r>
+        <w:t xml:space="preserve">&gt;&gt; - Application# - &lt;&lt;this.serialNo&gt;&gt; </w:t>
       </w:r>
     </w:p>
     <w:p>
@@ -65,7 +73,15 @@
         <w:spacing w:before="0" w:beforeAutospacing="0" w:after="0" w:afterAutospacing="0"/>
       </w:pPr>
       <w:r>
-        <w:t xml:space="preserve">Re:   &lt;&lt;this.orgName&gt;&gt; Ref. No. &lt;&lt;this.clientRefNo&gt;&gt; - SLW Ref. No. &lt;&lt;this.matterNo&gt;&gt; </w:t>
+        <w:t>Re:   &lt;&lt;</w:t>
+      </w:r>
+      <w:proofErr w:type="gramStart"/>
+      <w:r>
+        <w:t>this.orgName</w:t>
+      </w:r>
+      <w:proofErr w:type="gramEnd"/>
+      <w:r>
+        <w:t xml:space="preserve">&gt;&gt; Ref. No. &lt;&lt;this.clientRefNo&gt;&gt; - SLW Ref. No. &lt;&lt;this.matterNo&gt;&gt; </w:t>
       </w:r>
       <w:r>
         <w:br/>
@@ -108,52 +124,38 @@
         <w:t>&lt;&lt;userChoice&gt;&gt;</w:t>
       </w:r>
       <w:r>
-        <w:t>, please sign and date the document where prompted by the Adobe Sign tags next to your signature field(s) and click Finish when done.</w:t>
-      </w:r>
-    </w:p>
-    <w:p>
-      <w:pPr>
-        <w:pStyle w:val="NormalWeb"/>
-        <w:spacing w:before="0" w:beforeAutospacing="0" w:after="0" w:afterAutospacing="0"/>
-      </w:pPr>
-    </w:p>
-    <w:p>
-      <w:pPr>
-        <w:pStyle w:val="NormalWeb"/>
-        <w:spacing w:before="0" w:beforeAutospacing="0" w:after="0" w:afterAutospacing="0"/>
-      </w:pPr>
-      <w:r>
-        <w:t>We will proceed to file with the USPTO immediately upon receipt of the executed document. Please contact us directly to discuss any questions you may have concerning this document.</w:t>
-      </w:r>
-    </w:p>
-    <w:p>
-      <w:pPr>
-        <w:pStyle w:val="NormalWeb"/>
-        <w:spacing w:before="0" w:beforeAutospacing="0" w:after="0" w:afterAutospacing="0"/>
-      </w:pPr>
-    </w:p>
-    <w:p>
-      <w:pPr>
-        <w:pStyle w:val="NormalWeb"/>
-        <w:spacing w:before="0" w:beforeAutospacing="0" w:after="0" w:afterAutospacing="0"/>
-      </w:pPr>
-      <w:r>
-        <w:t xml:space="preserve">Very truly yours, </w:t>
-      </w:r>
-    </w:p>
-    <w:p>
-      <w:pPr>
-        <w:pStyle w:val="NormalWeb"/>
-        <w:spacing w:before="0" w:beforeAutospacing="0" w:after="0" w:afterAutospacing="0"/>
-      </w:pPr>
-    </w:p>
-    <w:p>
-      <w:pPr>
-        <w:pStyle w:val="NormalWeb"/>
-        <w:spacing w:before="0" w:beforeAutospacing="0" w:after="0" w:afterAutospacing="0"/>
-      </w:pPr>
-      <w:r>
-        <w:t>&lt;&lt;this.cmgName&gt;&gt;</w:t>
+        <w:t xml:space="preserve">, please sign and date the document </w:t>
+      </w:r>
+      <w:proofErr w:type="gramStart"/>
+      <w:r>
+        <w:t>where</w:t>
+      </w:r>
+      <w:proofErr w:type="gramEnd"/>
+      <w:r>
+        <w:t xml:space="preserve"> prompted by the Adobe Sign tags next to your signature field(s) and click Finish when done.</w:t>
+      </w:r>
+    </w:p>
+    <w:p>
+      <w:pPr>
+        <w:pStyle w:val="NormalWeb"/>
+        <w:spacing w:before="0" w:beforeAutospacing="0" w:after="0" w:afterAutospacing="0"/>
+      </w:pPr>
+    </w:p>
+    <w:p>
+      <w:pPr>
+        <w:pStyle w:val="NormalWeb"/>
+        <w:spacing w:before="0" w:beforeAutospacing="0" w:after="0" w:afterAutospacing="0"/>
+      </w:pPr>
+      <w:r>
+        <w:t xml:space="preserve">We will proceed to file with the USPTO immediately upon receipt of the executed document. Please contact us directly to discuss any questions you may have </w:t>
+      </w:r>
+      <w:proofErr w:type="gramStart"/>
+      <w:r>
+        <w:t>concerning</w:t>
+      </w:r>
+      <w:proofErr w:type="gramEnd"/>
+      <w:r>
+        <w:t xml:space="preserve"> this document.</w:t>
       </w:r>
     </w:p>
     <w:p>

</xml_diff>